<commit_message>
Illustre 6 fiches de plus : escalier Scratch, carre mBot, quadrillage plan, grille robot, croquis cote, patron maquette
Schemas et gabarits originaux N&B ; consignes projete -> ci-dessous.
Les zones de dessin reservees sont remplacees par les gabarits imprimes
(quadrillage 1 cm pour le plan au 1/100, grille 6x6 de 1,5 cm par case).

Co-Authored-By: Claude Fable 5 <noreply@anthropic.com>
</commit_message>
<xml_diff>
--- a/public/2026/seq05/FICHE_S5-A02_CroquisCote_4eme.docx
+++ b/public/2026/seq05/FICHE_S5-A02_CroquisCote_4eme.docx
@@ -279,7 +279,7 @@
     </w:tbl>
     <w:p>
       <w:pPr>
-        <w:spacing w:after="96"/>
+        <w:spacing w:after="81"/>
       </w:pPr>
     </w:p>
     <w:tbl>
@@ -445,7 +445,7 @@
     </w:tbl>
     <w:p>
       <w:pPr>
-        <w:spacing w:after="128"/>
+        <w:spacing w:after="108"/>
       </w:pPr>
     </w:p>
     <w:tbl>
@@ -505,7 +505,7 @@
     </w:tbl>
     <w:p>
       <w:pPr>
-        <w:spacing w:after="128"/>
+        <w:spacing w:after="108"/>
       </w:pPr>
     </w:p>
     <w:tbl>
@@ -543,7 +543,7 @@
           </w:tcPr>
           <w:p>
             <w:pPr>
-              <w:spacing w:after="96"/>
+              <w:spacing w:after="81"/>
             </w:pPr>
             <w:r>
               <w:rPr>
@@ -580,7 +580,7 @@
     </w:tbl>
     <w:p>
       <w:pPr>
-        <w:spacing w:after="128"/>
+        <w:spacing w:after="108"/>
       </w:pPr>
     </w:p>
     <w:tbl>
@@ -631,7 +631,7 @@
                 <w:sz w:val="26"/>
                 <w:szCs w:val="26"/>
               </w:rPr>
-              <w:t xml:space="preserve">PARTIE 1 — Les règles du croquis coté  (exemple annoté projeté)</w:t>
+              <w:t xml:space="preserve">PARTIE 1 — Les règles du croquis coté  (exemple annoté ci-dessous)</w:t>
             </w:r>
           </w:p>
         </w:tc>
@@ -639,7 +639,46 @@
     </w:tbl>
     <w:p>
       <w:pPr>
-        <w:spacing w:after="64"/>
+        <w:spacing w:before="60" w:after="80"/>
+        <w:jc w:val="center"/>
+      </w:pPr>
+      <w:r>
+        <w:drawing xmlns:wp="http://schemas.openxmlformats.org/drawingml/2006/wordprocessingDrawing">
+          <wp:inline distT="0" distB="0" distL="0" distR="0">
+            <wp:extent cx="5472000" cy="1972800"/>
+            <wp:docPr id="9155" name="schema_schema_croquis_cote.png"/>
+            <a:graphic xmlns:a="http://schemas.openxmlformats.org/drawingml/2006/main">
+              <a:graphicData uri="http://schemas.openxmlformats.org/drawingml/2006/picture">
+                <pic:pic xmlns:pic="http://schemas.openxmlformats.org/drawingml/2006/picture">
+                  <pic:nvPicPr>
+                    <pic:cNvPr id="9155" name="schema_schema_croquis_cote.png"/>
+                    <pic:cNvPicPr/>
+                  </pic:nvPicPr>
+                  <pic:blipFill>
+                    <a:blip xmlns:r="http://schemas.openxmlformats.org/officeDocument/2006/relationships" r:embed="rId10"/>
+                    <a:stretch>
+                      <a:fillRect/>
+                    </a:stretch>
+                  </pic:blipFill>
+                  <pic:spPr>
+                    <a:xfrm>
+                      <a:off x="0" y="0"/>
+                      <a:ext cx="5472000" cy="1972800"/>
+                    </a:xfrm>
+                    <a:prstGeom prst="rect">
+                      <a:avLst/>
+                    </a:prstGeom>
+                  </pic:spPr>
+                </pic:pic>
+              </a:graphicData>
+            </a:graphic>
+          </wp:inline>
+        </w:drawing>
+      </w:r>
+    </w:p>
+    <w:p>
+      <w:pPr>
+        <w:spacing w:after="54"/>
       </w:pPr>
     </w:p>
     <w:tbl>
@@ -1023,7 +1062,7 @@
     </w:tbl>
     <w:p>
       <w:pPr>
-        <w:spacing w:after="80"/>
+        <w:spacing w:after="68"/>
       </w:pPr>
     </w:p>
     <w:tbl>
@@ -1082,12 +1121,12 @@
     </w:tbl>
     <w:p>
       <w:pPr>
-        <w:spacing w:after="64"/>
+        <w:spacing w:after="54"/>
       </w:pPr>
     </w:p>
     <w:p>
       <w:pPr>
-        <w:spacing w:after="96"/>
+        <w:spacing w:after="81"/>
       </w:pPr>
       <w:r>
         <w:rPr>
@@ -1372,7 +1411,7 @@
           </w:tcPr>
           <w:p>
             <w:pPr>
-              <w:spacing w:after="2500"/>
+              <w:spacing w:after="2240"/>
             </w:pPr>
             <w:r>
               <w:rPr>
@@ -1392,7 +1431,7 @@
     </w:tbl>
     <w:p>
       <w:pPr>
-        <w:spacing w:after="64"/>
+        <w:spacing w:after="54"/>
       </w:pPr>
     </w:p>
     <w:tbl>
@@ -1451,7 +1490,7 @@
     </w:tbl>
     <w:p>
       <w:pPr>
-        <w:spacing w:after="64"/>
+        <w:spacing w:after="54"/>
       </w:pPr>
     </w:p>
     <w:tbl>
@@ -2047,7 +2086,7 @@
     </w:tbl>
     <w:p>
       <w:pPr>
-        <w:spacing w:after="64" w:before="50"/>
+        <w:spacing w:after="54" w:before="50"/>
       </w:pPr>
       <w:r>
         <w:rPr>
@@ -2098,7 +2137,7 @@
           </w:tcPr>
           <w:p>
             <w:pPr>
-              <w:spacing w:after="96"/>
+              <w:spacing w:after="81"/>
             </w:pPr>
             <w:r>
               <w:rPr>
@@ -2115,7 +2154,7 @@
           </w:p>
           <w:p>
             <w:pPr>
-              <w:spacing w:after="96"/>
+              <w:spacing w:after="81"/>
             </w:pPr>
             <w:r>
               <w:rPr>
@@ -2132,7 +2171,7 @@
           </w:p>
           <w:p>
             <w:pPr>
-              <w:spacing w:after="96"/>
+              <w:spacing w:after="81"/>
             </w:pPr>
             <w:r>
               <w:rPr>

</xml_diff>